<commit_message>
Rewrite requirements in plainer language and remove highlight colors
Co-Authored-By: Claude Opus 5.5 <noreply@anthropic.com>
Claude-Session: https://claude.ai/code/session_019Ph7hbBFHvBPtiJYxtXsgz
</commit_message>
<xml_diff>
--- a/Banking_System_Requirements.docx
+++ b/Banking_System_Requirements.docx
@@ -10,7 +10,6 @@
           <w:bottom w:val="single" w:sz="2" w:space="0" w:color="auto"/>
           <w:right w:val="single" w:sz="2" w:space="0" w:color="auto"/>
         </w:pBdr>
-        <w:shd w:val="clear" w:color="auto" w:fill="F8F4F2"/>
         <w:spacing w:before="100" w:beforeAutospacing="1" w:after="100" w:afterAutospacing="1" w:line="240" w:lineRule="auto"/>
         <w:outlineLvl w:val="2"/>
         <w:rPr>
@@ -302,17 +301,15 @@
                 <w:kern w:val="0"/>
                 <w:sz w:val="24"/>
                 <w:szCs w:val="24"/>
-                <w:highlight w:val="yellow"/>
-                <w14:ligatures w14:val="none"/>
-              </w:rPr>
-            </w:pPr>
-            <w:r>
-              <w:rPr>
-                <w:rFonts w:ascii="Times New Roman" w:eastAsia="Times New Roman" w:hAnsi="Times New Roman" w:cs="Times New Roman"/>
-                <w:kern w:val="0"/>
-                <w:sz w:val="24"/>
-                <w:szCs w:val="24"/>
-                <w:highlight w:val="yellow"/>
+                <w14:ligatures w14:val="none"/>
+              </w:rPr>
+            </w:pPr>
+            <w:r>
+              <w:rPr>
+                <w:rFonts w:ascii="Times New Roman" w:eastAsia="Times New Roman" w:hAnsi="Times New Roman" w:cs="Times New Roman"/>
+                <w:kern w:val="0"/>
+                <w:sz w:val="24"/>
+                <w:szCs w:val="24"/>
                 <w14:ligatures w14:val="none"/>
               </w:rPr>
               <w:t>Must Have</w:t>
@@ -350,7 +347,7 @@
                 <w:szCs w:val="24"/>
                 <w14:ligatures w14:val="none"/>
               </w:rPr>
-              <w:t>Users should be able to log in securely using a username and password.</w:t>
+              <w:t xml:space="preserve">Users can log in securely with their username and password.</w:t>
             </w:r>
           </w:p>
         </w:tc>
@@ -449,17 +446,15 @@
                 <w:kern w:val="0"/>
                 <w:sz w:val="24"/>
                 <w:szCs w:val="24"/>
-                <w:highlight w:val="yellow"/>
-                <w14:ligatures w14:val="none"/>
-              </w:rPr>
-            </w:pPr>
-            <w:r>
-              <w:rPr>
-                <w:rFonts w:ascii="Times New Roman" w:eastAsia="Times New Roman" w:hAnsi="Times New Roman" w:cs="Times New Roman"/>
-                <w:kern w:val="0"/>
-                <w:sz w:val="24"/>
-                <w:szCs w:val="24"/>
-                <w:highlight w:val="yellow"/>
+                <w14:ligatures w14:val="none"/>
+              </w:rPr>
+            </w:pPr>
+            <w:r>
+              <w:rPr>
+                <w:rFonts w:ascii="Times New Roman" w:eastAsia="Times New Roman" w:hAnsi="Times New Roman" w:cs="Times New Roman"/>
+                <w:kern w:val="0"/>
+                <w:sz w:val="24"/>
+                <w:szCs w:val="24"/>
                 <w14:ligatures w14:val="none"/>
               </w:rPr>
               <w:t>Must Have</w:t>
@@ -497,7 +492,7 @@
                 <w:szCs w:val="24"/>
                 <w14:ligatures w14:val="none"/>
               </w:rPr>
-              <w:t>New customers can create an account by signing up with necessary personal information.</w:t>
+              <w:t xml:space="preserve">New customers can open an account by signing up and entering their personal details.</w:t>
             </w:r>
           </w:p>
         </w:tc>
@@ -596,17 +591,15 @@
                 <w:kern w:val="0"/>
                 <w:sz w:val="24"/>
                 <w:szCs w:val="24"/>
-                <w:highlight w:val="yellow"/>
-                <w14:ligatures w14:val="none"/>
-              </w:rPr>
-            </w:pPr>
-            <w:r>
-              <w:rPr>
-                <w:rFonts w:ascii="Times New Roman" w:eastAsia="Times New Roman" w:hAnsi="Times New Roman" w:cs="Times New Roman"/>
-                <w:kern w:val="0"/>
-                <w:sz w:val="24"/>
-                <w:szCs w:val="24"/>
-                <w:highlight w:val="yellow"/>
+                <w14:ligatures w14:val="none"/>
+              </w:rPr>
+            </w:pPr>
+            <w:r>
+              <w:rPr>
+                <w:rFonts w:ascii="Times New Roman" w:eastAsia="Times New Roman" w:hAnsi="Times New Roman" w:cs="Times New Roman"/>
+                <w:kern w:val="0"/>
+                <w:sz w:val="24"/>
+                <w:szCs w:val="24"/>
                 <w14:ligatures w14:val="none"/>
               </w:rPr>
               <w:t>Must Have</w:t>
@@ -644,7 +637,7 @@
                 <w:szCs w:val="24"/>
                 <w14:ligatures w14:val="none"/>
               </w:rPr>
-              <w:t>Users must be able to view and edit the personal information attached to the account.</w:t>
+              <w:t xml:space="preserve">Users can view and update the personal information linked to their account.</w:t>
             </w:r>
           </w:p>
         </w:tc>
@@ -743,17 +736,15 @@
                 <w:kern w:val="0"/>
                 <w:sz w:val="24"/>
                 <w:szCs w:val="24"/>
-                <w:highlight w:val="yellow"/>
-                <w14:ligatures w14:val="none"/>
-              </w:rPr>
-            </w:pPr>
-            <w:r>
-              <w:rPr>
-                <w:rFonts w:ascii="Times New Roman" w:eastAsia="Times New Roman" w:hAnsi="Times New Roman" w:cs="Times New Roman"/>
-                <w:kern w:val="0"/>
-                <w:sz w:val="24"/>
-                <w:szCs w:val="24"/>
-                <w:highlight w:val="yellow"/>
+                <w14:ligatures w14:val="none"/>
+              </w:rPr>
+            </w:pPr>
+            <w:r>
+              <w:rPr>
+                <w:rFonts w:ascii="Times New Roman" w:eastAsia="Times New Roman" w:hAnsi="Times New Roman" w:cs="Times New Roman"/>
+                <w:kern w:val="0"/>
+                <w:sz w:val="24"/>
+                <w:szCs w:val="24"/>
                 <w14:ligatures w14:val="none"/>
               </w:rPr>
               <w:t>Must Have</w:t>
@@ -791,7 +782,7 @@
                 <w:szCs w:val="24"/>
                 <w14:ligatures w14:val="none"/>
               </w:rPr>
-              <w:t>Users shall be able to view their account balance at any instant in time.</w:t>
+              <w:t xml:space="preserve">Users can check their current balance at any time.</w:t>
             </w:r>
           </w:p>
         </w:tc>
@@ -890,17 +881,15 @@
                 <w:kern w:val="0"/>
                 <w:sz w:val="24"/>
                 <w:szCs w:val="24"/>
-                <w:highlight w:val="yellow"/>
-                <w14:ligatures w14:val="none"/>
-              </w:rPr>
-            </w:pPr>
-            <w:r>
-              <w:rPr>
-                <w:rFonts w:ascii="Times New Roman" w:eastAsia="Times New Roman" w:hAnsi="Times New Roman" w:cs="Times New Roman"/>
-                <w:kern w:val="0"/>
-                <w:sz w:val="24"/>
-                <w:szCs w:val="24"/>
-                <w:highlight w:val="yellow"/>
+                <w14:ligatures w14:val="none"/>
+              </w:rPr>
+            </w:pPr>
+            <w:r>
+              <w:rPr>
+                <w:rFonts w:ascii="Times New Roman" w:eastAsia="Times New Roman" w:hAnsi="Times New Roman" w:cs="Times New Roman"/>
+                <w:kern w:val="0"/>
+                <w:sz w:val="24"/>
+                <w:szCs w:val="24"/>
                 <w14:ligatures w14:val="none"/>
               </w:rPr>
               <w:t>Must Have</w:t>
@@ -938,7 +927,7 @@
                 <w:szCs w:val="24"/>
                 <w14:ligatures w14:val="none"/>
               </w:rPr>
-              <w:t>Users shall be able to initiate an internal transfer to another account or to another user</w:t>
+              <w:t xml:space="preserve">Users can move money between their own accounts or send it to another user.</w:t>
             </w:r>
           </w:p>
         </w:tc>
@@ -1037,17 +1026,15 @@
                 <w:kern w:val="0"/>
                 <w:sz w:val="24"/>
                 <w:szCs w:val="24"/>
-                <w:highlight w:val="yellow"/>
-                <w14:ligatures w14:val="none"/>
-              </w:rPr>
-            </w:pPr>
-            <w:r>
-              <w:rPr>
-                <w:rFonts w:ascii="Times New Roman" w:eastAsia="Times New Roman" w:hAnsi="Times New Roman" w:cs="Times New Roman"/>
-                <w:kern w:val="0"/>
-                <w:sz w:val="24"/>
-                <w:szCs w:val="24"/>
-                <w:highlight w:val="yellow"/>
+                <w14:ligatures w14:val="none"/>
+              </w:rPr>
+            </w:pPr>
+            <w:r>
+              <w:rPr>
+                <w:rFonts w:ascii="Times New Roman" w:eastAsia="Times New Roman" w:hAnsi="Times New Roman" w:cs="Times New Roman"/>
+                <w:kern w:val="0"/>
+                <w:sz w:val="24"/>
+                <w:szCs w:val="24"/>
                 <w14:ligatures w14:val="none"/>
               </w:rPr>
               <w:t>Must Have</w:t>
@@ -1085,7 +1072,7 @@
                 <w:szCs w:val="24"/>
                 <w14:ligatures w14:val="none"/>
               </w:rPr>
-              <w:t xml:space="preserve">The system should provide a facility to view the transaction history for any period of time.</w:t>
+              <w:t xml:space="preserve">Users can see their transaction history for any date range they pick.</w:t>
             </w:r>
           </w:p>
         </w:tc>
@@ -1184,17 +1171,15 @@
                 <w:kern w:val="0"/>
                 <w:sz w:val="24"/>
                 <w:szCs w:val="24"/>
-                <w:highlight w:val="yellow"/>
-                <w14:ligatures w14:val="none"/>
-              </w:rPr>
-            </w:pPr>
-            <w:r>
-              <w:rPr>
-                <w:rFonts w:ascii="Times New Roman" w:eastAsia="Times New Roman" w:hAnsi="Times New Roman" w:cs="Times New Roman"/>
-                <w:kern w:val="0"/>
-                <w:sz w:val="24"/>
-                <w:szCs w:val="24"/>
-                <w:highlight w:val="yellow"/>
+                <w14:ligatures w14:val="none"/>
+              </w:rPr>
+            </w:pPr>
+            <w:r>
+              <w:rPr>
+                <w:rFonts w:ascii="Times New Roman" w:eastAsia="Times New Roman" w:hAnsi="Times New Roman" w:cs="Times New Roman"/>
+                <w:kern w:val="0"/>
+                <w:sz w:val="24"/>
+                <w:szCs w:val="24"/>
                 <w14:ligatures w14:val="none"/>
               </w:rPr>
               <w:t>Must Have</w:t>
@@ -1232,7 +1217,7 @@
                 <w:szCs w:val="24"/>
                 <w14:ligatures w14:val="none"/>
               </w:rPr>
-              <w:t>The customer must be enabled with the facility to apply for a loan within the banking system.</w:t>
+              <w:t xml:space="preserve">Customers can apply for a loan directly through the system.</w:t>
             </w:r>
           </w:p>
         </w:tc>
@@ -1331,17 +1316,15 @@
                 <w:kern w:val="0"/>
                 <w:sz w:val="24"/>
                 <w:szCs w:val="24"/>
-                <w:highlight w:val="yellow"/>
-                <w14:ligatures w14:val="none"/>
-              </w:rPr>
-            </w:pPr>
-            <w:r>
-              <w:rPr>
-                <w:rFonts w:ascii="Times New Roman" w:eastAsia="Times New Roman" w:hAnsi="Times New Roman" w:cs="Times New Roman"/>
-                <w:kern w:val="0"/>
-                <w:sz w:val="24"/>
-                <w:szCs w:val="24"/>
-                <w:highlight w:val="yellow"/>
+                <w14:ligatures w14:val="none"/>
+              </w:rPr>
+            </w:pPr>
+            <w:r>
+              <w:rPr>
+                <w:rFonts w:ascii="Times New Roman" w:eastAsia="Times New Roman" w:hAnsi="Times New Roman" w:cs="Times New Roman"/>
+                <w:kern w:val="0"/>
+                <w:sz w:val="24"/>
+                <w:szCs w:val="24"/>
                 <w14:ligatures w14:val="none"/>
               </w:rPr>
               <w:t>Must Have</w:t>
@@ -1379,7 +1362,7 @@
                 <w:szCs w:val="24"/>
                 <w14:ligatures w14:val="none"/>
               </w:rPr>
-              <w:t>Users must be provided with the facility to check the status regarding their loan applications.</w:t>
+              <w:t xml:space="preserve">Users can check where their loan application stands.</w:t>
             </w:r>
           </w:p>
         </w:tc>
@@ -1478,17 +1461,15 @@
                 <w:kern w:val="0"/>
                 <w:sz w:val="24"/>
                 <w:szCs w:val="24"/>
-                <w:highlight w:val="yellow"/>
-                <w14:ligatures w14:val="none"/>
-              </w:rPr>
-            </w:pPr>
-            <w:r>
-              <w:rPr>
-                <w:rFonts w:ascii="Times New Roman" w:eastAsia="Times New Roman" w:hAnsi="Times New Roman" w:cs="Times New Roman"/>
-                <w:kern w:val="0"/>
-                <w:sz w:val="24"/>
-                <w:szCs w:val="24"/>
-                <w:highlight w:val="yellow"/>
+                <w14:ligatures w14:val="none"/>
+              </w:rPr>
+            </w:pPr>
+            <w:r>
+              <w:rPr>
+                <w:rFonts w:ascii="Times New Roman" w:eastAsia="Times New Roman" w:hAnsi="Times New Roman" w:cs="Times New Roman"/>
+                <w:kern w:val="0"/>
+                <w:sz w:val="24"/>
+                <w:szCs w:val="24"/>
                 <w14:ligatures w14:val="none"/>
               </w:rPr>
               <w:t>Must Have</w:t>
@@ -1526,7 +1507,7 @@
                 <w:szCs w:val="24"/>
                 <w14:ligatures w14:val="none"/>
               </w:rPr>
-              <w:t>Users shall have the facility to make the bill payments directly via the banking system.</w:t>
+              <w:t xml:space="preserve">Users can pay their bills directly through the system.</w:t>
             </w:r>
           </w:p>
         </w:tc>
@@ -1625,17 +1606,15 @@
                 <w:kern w:val="0"/>
                 <w:sz w:val="24"/>
                 <w:szCs w:val="24"/>
-                <w:highlight w:val="yellow"/>
-                <w14:ligatures w14:val="none"/>
-              </w:rPr>
-            </w:pPr>
-            <w:r>
-              <w:rPr>
-                <w:rFonts w:ascii="Times New Roman" w:eastAsia="Times New Roman" w:hAnsi="Times New Roman" w:cs="Times New Roman"/>
-                <w:kern w:val="0"/>
-                <w:sz w:val="24"/>
-                <w:szCs w:val="24"/>
-                <w:highlight w:val="yellow"/>
+                <w14:ligatures w14:val="none"/>
+              </w:rPr>
+            </w:pPr>
+            <w:r>
+              <w:rPr>
+                <w:rFonts w:ascii="Times New Roman" w:eastAsia="Times New Roman" w:hAnsi="Times New Roman" w:cs="Times New Roman"/>
+                <w:kern w:val="0"/>
+                <w:sz w:val="24"/>
+                <w:szCs w:val="24"/>
                 <w14:ligatures w14:val="none"/>
               </w:rPr>
               <w:t>Must Have</w:t>
@@ -1673,7 +1652,7 @@
                 <w:szCs w:val="24"/>
                 <w14:ligatures w14:val="none"/>
               </w:rPr>
-              <w:t>Users shall receive notifications for major account activities involving large withdrawals.</w:t>
+              <w:t xml:space="preserve">Users get notified about important account activity, like large withdrawals.</w:t>
             </w:r>
           </w:p>
         </w:tc>
@@ -1772,17 +1751,15 @@
                 <w:kern w:val="0"/>
                 <w:sz w:val="24"/>
                 <w:szCs w:val="24"/>
-                <w:highlight w:val="red"/>
-                <w14:ligatures w14:val="none"/>
-              </w:rPr>
-            </w:pPr>
-            <w:r>
-              <w:rPr>
-                <w:rFonts w:ascii="Times New Roman" w:eastAsia="Times New Roman" w:hAnsi="Times New Roman" w:cs="Times New Roman"/>
-                <w:kern w:val="0"/>
-                <w:sz w:val="24"/>
-                <w:szCs w:val="24"/>
-                <w:highlight w:val="red"/>
+                <w14:ligatures w14:val="none"/>
+              </w:rPr>
+            </w:pPr>
+            <w:r>
+              <w:rPr>
+                <w:rFonts w:ascii="Times New Roman" w:eastAsia="Times New Roman" w:hAnsi="Times New Roman" w:cs="Times New Roman"/>
+                <w:kern w:val="0"/>
+                <w:sz w:val="24"/>
+                <w:szCs w:val="24"/>
                 <w14:ligatures w14:val="none"/>
               </w:rPr>
               <w:t>Should Have</w:t>
@@ -1820,7 +1797,7 @@
                 <w:szCs w:val="24"/>
                 <w14:ligatures w14:val="none"/>
               </w:rPr>
-              <w:t>Users shall be able to request, activate, and manage their debit and credit cards.</w:t>
+              <w:t xml:space="preserve">Users can request, activate, and manage their debit and credit cards.</w:t>
             </w:r>
           </w:p>
         </w:tc>
@@ -1919,17 +1896,15 @@
                 <w:kern w:val="0"/>
                 <w:sz w:val="24"/>
                 <w:szCs w:val="24"/>
-                <w:highlight w:val="red"/>
-                <w14:ligatures w14:val="none"/>
-              </w:rPr>
-            </w:pPr>
-            <w:r>
-              <w:rPr>
-                <w:rFonts w:ascii="Times New Roman" w:eastAsia="Times New Roman" w:hAnsi="Times New Roman" w:cs="Times New Roman"/>
-                <w:kern w:val="0"/>
-                <w:sz w:val="24"/>
-                <w:szCs w:val="24"/>
-                <w:highlight w:val="red"/>
+                <w14:ligatures w14:val="none"/>
+              </w:rPr>
+            </w:pPr>
+            <w:r>
+              <w:rPr>
+                <w:rFonts w:ascii="Times New Roman" w:eastAsia="Times New Roman" w:hAnsi="Times New Roman" w:cs="Times New Roman"/>
+                <w:kern w:val="0"/>
+                <w:sz w:val="24"/>
+                <w:szCs w:val="24"/>
                 <w14:ligatures w14:val="none"/>
               </w:rPr>
               <w:t>Should Have</w:t>
@@ -1967,7 +1942,7 @@
                 <w:szCs w:val="24"/>
                 <w14:ligatures w14:val="none"/>
               </w:rPr>
-              <w:t>Users should be able to find the nearest ATM based on their current location in the application.</w:t>
+              <w:t xml:space="preserve">Users can find the nearest ATM based on where they are.</w:t>
             </w:r>
           </w:p>
         </w:tc>
@@ -2066,17 +2041,15 @@
                 <w:kern w:val="0"/>
                 <w:sz w:val="24"/>
                 <w:szCs w:val="24"/>
-                <w:highlight w:val="red"/>
-                <w14:ligatures w14:val="none"/>
-              </w:rPr>
-            </w:pPr>
-            <w:r>
-              <w:rPr>
-                <w:rFonts w:ascii="Times New Roman" w:eastAsia="Times New Roman" w:hAnsi="Times New Roman" w:cs="Times New Roman"/>
-                <w:kern w:val="0"/>
-                <w:sz w:val="24"/>
-                <w:szCs w:val="24"/>
-                <w:highlight w:val="red"/>
+                <w14:ligatures w14:val="none"/>
+              </w:rPr>
+            </w:pPr>
+            <w:r>
+              <w:rPr>
+                <w:rFonts w:ascii="Times New Roman" w:eastAsia="Times New Roman" w:hAnsi="Times New Roman" w:cs="Times New Roman"/>
+                <w:kern w:val="0"/>
+                <w:sz w:val="24"/>
+                <w:szCs w:val="24"/>
                 <w14:ligatures w14:val="none"/>
               </w:rPr>
               <w:t>Should Have</w:t>
@@ -2114,7 +2087,7 @@
                 <w:szCs w:val="24"/>
                 <w14:ligatures w14:val="none"/>
               </w:rPr>
-              <w:t>Users shall have the facility to reach customer support directly via the system.</w:t>
+              <w:t xml:space="preserve">Users can contact customer support right from the app.</w:t>
             </w:r>
           </w:p>
         </w:tc>
@@ -2213,17 +2186,15 @@
                 <w:kern w:val="0"/>
                 <w:sz w:val="24"/>
                 <w:szCs w:val="24"/>
-                <w:highlight w:val="red"/>
-                <w14:ligatures w14:val="none"/>
-              </w:rPr>
-            </w:pPr>
-            <w:r>
-              <w:rPr>
-                <w:rFonts w:ascii="Times New Roman" w:eastAsia="Times New Roman" w:hAnsi="Times New Roman" w:cs="Times New Roman"/>
-                <w:kern w:val="0"/>
-                <w:sz w:val="24"/>
-                <w:szCs w:val="24"/>
-                <w:highlight w:val="red"/>
+                <w14:ligatures w14:val="none"/>
+              </w:rPr>
+            </w:pPr>
+            <w:r>
+              <w:rPr>
+                <w:rFonts w:ascii="Times New Roman" w:eastAsia="Times New Roman" w:hAnsi="Times New Roman" w:cs="Times New Roman"/>
+                <w:kern w:val="0"/>
+                <w:sz w:val="24"/>
+                <w:szCs w:val="24"/>
                 <w14:ligatures w14:val="none"/>
               </w:rPr>
               <w:t>Should Have</w:t>
@@ -2261,7 +2232,7 @@
                 <w:szCs w:val="24"/>
                 <w14:ligatures w14:val="none"/>
               </w:rPr>
-              <w:t>Users shall be able to activate other security features such as two-factor authentication.</w:t>
+              <w:t xml:space="preserve">Users can turn on extra security, such as two-factor authentication.</w:t>
             </w:r>
           </w:p>
         </w:tc>
@@ -2360,17 +2331,15 @@
                 <w:kern w:val="0"/>
                 <w:sz w:val="24"/>
                 <w:szCs w:val="24"/>
-                <w:highlight w:val="blue"/>
-                <w14:ligatures w14:val="none"/>
-              </w:rPr>
-            </w:pPr>
-            <w:r>
-              <w:rPr>
-                <w:rFonts w:ascii="Times New Roman" w:eastAsia="Times New Roman" w:hAnsi="Times New Roman" w:cs="Times New Roman"/>
-                <w:kern w:val="0"/>
-                <w:sz w:val="24"/>
-                <w:szCs w:val="24"/>
-                <w:highlight w:val="blue"/>
+                <w14:ligatures w14:val="none"/>
+              </w:rPr>
+            </w:pPr>
+            <w:r>
+              <w:rPr>
+                <w:rFonts w:ascii="Times New Roman" w:eastAsia="Times New Roman" w:hAnsi="Times New Roman" w:cs="Times New Roman"/>
+                <w:kern w:val="0"/>
+                <w:sz w:val="24"/>
+                <w:szCs w:val="24"/>
                 <w14:ligatures w14:val="none"/>
               </w:rPr>
               <w:t>Could Have</w:t>
@@ -2408,7 +2377,7 @@
                 <w:szCs w:val="24"/>
                 <w14:ligatures w14:val="none"/>
               </w:rPr>
-              <w:t>Users can close accounts through the system.</w:t>
+              <w:t xml:space="preserve">Users can close their account through the system.</w:t>
             </w:r>
           </w:p>
         </w:tc>
@@ -2507,17 +2476,15 @@
                 <w:kern w:val="0"/>
                 <w:sz w:val="24"/>
                 <w:szCs w:val="24"/>
-                <w:highlight w:val="blue"/>
-                <w14:ligatures w14:val="none"/>
-              </w:rPr>
-            </w:pPr>
-            <w:r>
-              <w:rPr>
-                <w:rFonts w:ascii="Times New Roman" w:eastAsia="Times New Roman" w:hAnsi="Times New Roman" w:cs="Times New Roman"/>
-                <w:kern w:val="0"/>
-                <w:sz w:val="24"/>
-                <w:szCs w:val="24"/>
-                <w:highlight w:val="blue"/>
+                <w14:ligatures w14:val="none"/>
+              </w:rPr>
+            </w:pPr>
+            <w:r>
+              <w:rPr>
+                <w:rFonts w:ascii="Times New Roman" w:eastAsia="Times New Roman" w:hAnsi="Times New Roman" w:cs="Times New Roman"/>
+                <w:kern w:val="0"/>
+                <w:sz w:val="24"/>
+                <w:szCs w:val="24"/>
                 <w14:ligatures w14:val="none"/>
               </w:rPr>
               <w:t>Could Have</w:t>
@@ -2555,7 +2522,7 @@
                 <w:szCs w:val="24"/>
                 <w14:ligatures w14:val="none"/>
               </w:rPr>
-              <w:t>Users shall be able to deposit checks using a mobile device.</w:t>
+              <w:t xml:space="preserve">Users can deposit a check by taking a photo of it with their phone.</w:t>
             </w:r>
           </w:p>
         </w:tc>
@@ -2655,17 +2622,15 @@
                 <w:kern w:val="0"/>
                 <w:sz w:val="24"/>
                 <w:szCs w:val="24"/>
-                <w:highlight w:val="blue"/>
-                <w14:ligatures w14:val="none"/>
-              </w:rPr>
-            </w:pPr>
-            <w:r>
-              <w:rPr>
-                <w:rFonts w:ascii="Times New Roman" w:eastAsia="Times New Roman" w:hAnsi="Times New Roman" w:cs="Times New Roman"/>
-                <w:kern w:val="0"/>
-                <w:sz w:val="24"/>
-                <w:szCs w:val="24"/>
-                <w:highlight w:val="blue"/>
+                <w14:ligatures w14:val="none"/>
+              </w:rPr>
+            </w:pPr>
+            <w:r>
+              <w:rPr>
+                <w:rFonts w:ascii="Times New Roman" w:eastAsia="Times New Roman" w:hAnsi="Times New Roman" w:cs="Times New Roman"/>
+                <w:kern w:val="0"/>
+                <w:sz w:val="24"/>
+                <w:szCs w:val="24"/>
                 <w14:ligatures w14:val="none"/>
               </w:rPr>
               <w:t>Could Have</w:t>
@@ -2703,7 +2668,7 @@
                 <w:szCs w:val="24"/>
                 <w14:ligatures w14:val="none"/>
               </w:rPr>
-              <w:t>Interest on the saving account shall be calculated automatically and presented to the users of the system.</w:t>
+              <w:t xml:space="preserve">Interest on savings accounts is calculated automatically and shown to the user.</w:t>
             </w:r>
           </w:p>
         </w:tc>
@@ -2802,17 +2767,15 @@
                 <w:kern w:val="0"/>
                 <w:sz w:val="24"/>
                 <w:szCs w:val="24"/>
-                <w:highlight w:val="blue"/>
-                <w14:ligatures w14:val="none"/>
-              </w:rPr>
-            </w:pPr>
-            <w:r>
-              <w:rPr>
-                <w:rFonts w:ascii="Times New Roman" w:eastAsia="Times New Roman" w:hAnsi="Times New Roman" w:cs="Times New Roman"/>
-                <w:kern w:val="0"/>
-                <w:sz w:val="24"/>
-                <w:szCs w:val="24"/>
-                <w:highlight w:val="blue"/>
+                <w14:ligatures w14:val="none"/>
+              </w:rPr>
+            </w:pPr>
+            <w:r>
+              <w:rPr>
+                <w:rFonts w:ascii="Times New Roman" w:eastAsia="Times New Roman" w:hAnsi="Times New Roman" w:cs="Times New Roman"/>
+                <w:kern w:val="0"/>
+                <w:sz w:val="24"/>
+                <w:szCs w:val="24"/>
                 <w14:ligatures w14:val="none"/>
               </w:rPr>
               <w:t>Could Have</w:t>
@@ -2850,7 +2813,7 @@
                 <w:szCs w:val="24"/>
                 <w14:ligatures w14:val="none"/>
               </w:rPr>
-              <w:t>The system should be able to monitor account activity for fraudulent acts and flag suspicious ones.</w:t>
+              <w:t xml:space="preserve">The system watches account activity and flags anything that looks suspicious.</w:t>
             </w:r>
           </w:p>
         </w:tc>
@@ -2949,17 +2912,15 @@
                 <w:kern w:val="0"/>
                 <w:sz w:val="24"/>
                 <w:szCs w:val="24"/>
-                <w:highlight w:val="darkYellow"/>
-                <w14:ligatures w14:val="none"/>
-              </w:rPr>
-            </w:pPr>
-            <w:r>
-              <w:rPr>
-                <w:rFonts w:ascii="Times New Roman" w:eastAsia="Times New Roman" w:hAnsi="Times New Roman" w:cs="Times New Roman"/>
-                <w:kern w:val="0"/>
-                <w:sz w:val="24"/>
-                <w:szCs w:val="24"/>
-                <w:highlight w:val="darkYellow"/>
+                <w14:ligatures w14:val="none"/>
+              </w:rPr>
+            </w:pPr>
+            <w:r>
+              <w:rPr>
+                <w:rFonts w:ascii="Times New Roman" w:eastAsia="Times New Roman" w:hAnsi="Times New Roman" w:cs="Times New Roman"/>
+                <w:kern w:val="0"/>
+                <w:sz w:val="24"/>
+                <w:szCs w:val="24"/>
                 <w14:ligatures w14:val="none"/>
               </w:rPr>
               <w:t>Won’t Have</w:t>
@@ -2997,7 +2958,7 @@
                 <w:szCs w:val="24"/>
                 <w14:ligatures w14:val="none"/>
               </w:rPr>
-              <w:t>Feedback on banking services provided should be a facility for the users.</w:t>
+              <w:t xml:space="preserve">Users can leave feedback about the bank's services.</w:t>
             </w:r>
           </w:p>
         </w:tc>
@@ -3096,17 +3057,15 @@
                 <w:kern w:val="0"/>
                 <w:sz w:val="24"/>
                 <w:szCs w:val="24"/>
-                <w:highlight w:val="darkYellow"/>
-                <w14:ligatures w14:val="none"/>
-              </w:rPr>
-            </w:pPr>
-            <w:r>
-              <w:rPr>
-                <w:rFonts w:ascii="Times New Roman" w:eastAsia="Times New Roman" w:hAnsi="Times New Roman" w:cs="Times New Roman"/>
-                <w:kern w:val="0"/>
-                <w:sz w:val="24"/>
-                <w:szCs w:val="24"/>
-                <w:highlight w:val="darkYellow"/>
+                <w14:ligatures w14:val="none"/>
+              </w:rPr>
+            </w:pPr>
+            <w:r>
+              <w:rPr>
+                <w:rFonts w:ascii="Times New Roman" w:eastAsia="Times New Roman" w:hAnsi="Times New Roman" w:cs="Times New Roman"/>
+                <w:kern w:val="0"/>
+                <w:sz w:val="24"/>
+                <w:szCs w:val="24"/>
                 <w14:ligatures w14:val="none"/>
               </w:rPr>
               <w:t>Won’t Have</w:t>
@@ -3144,7 +3103,7 @@
                 <w:szCs w:val="24"/>
                 <w14:ligatures w14:val="none"/>
               </w:rPr>
-              <w:t>The system should support various languages for user accessibility.</w:t>
+              <w:t xml:space="preserve">The app is available in several languages.</w:t>
             </w:r>
           </w:p>
           <w:p>
@@ -3170,7 +3129,6 @@
           <w:bottom w:val="single" w:sz="2" w:space="0" w:color="auto"/>
           <w:right w:val="single" w:sz="2" w:space="0" w:color="auto"/>
         </w:pBdr>
-        <w:shd w:val="clear" w:color="auto" w:fill="F8F4F2"/>
         <w:spacing w:before="100" w:beforeAutospacing="1" w:after="100" w:afterAutospacing="1" w:line="240" w:lineRule="auto"/>
         <w:outlineLvl w:val="2"/>
         <w:rPr>
@@ -3462,17 +3420,15 @@
                 <w:kern w:val="0"/>
                 <w:sz w:val="24"/>
                 <w:szCs w:val="24"/>
-                <w:highlight w:val="yellow"/>
-                <w14:ligatures w14:val="none"/>
-              </w:rPr>
-            </w:pPr>
-            <w:r>
-              <w:rPr>
-                <w:rFonts w:ascii="Times New Roman" w:eastAsia="Times New Roman" w:hAnsi="Times New Roman" w:cs="Times New Roman"/>
-                <w:kern w:val="0"/>
-                <w:sz w:val="24"/>
-                <w:szCs w:val="24"/>
-                <w:highlight w:val="yellow"/>
+                <w14:ligatures w14:val="none"/>
+              </w:rPr>
+            </w:pPr>
+            <w:r>
+              <w:rPr>
+                <w:rFonts w:ascii="Times New Roman" w:eastAsia="Times New Roman" w:hAnsi="Times New Roman" w:cs="Times New Roman"/>
+                <w:kern w:val="0"/>
+                <w:sz w:val="24"/>
+                <w:szCs w:val="24"/>
                 <w14:ligatures w14:val="none"/>
               </w:rPr>
               <w:t>Must Have</w:t>
@@ -3510,7 +3466,7 @@
                 <w:szCs w:val="24"/>
                 <w14:ligatures w14:val="none"/>
               </w:rPr>
-              <w:t>The system must handle up to 10,000 simultaneous users without performance degradation.</w:t>
+              <w:t xml:space="preserve">The system must support up to 10,000 users at once without slowing down.</w:t>
             </w:r>
           </w:p>
         </w:tc>
@@ -3609,17 +3565,15 @@
                 <w:kern w:val="0"/>
                 <w:sz w:val="24"/>
                 <w:szCs w:val="24"/>
-                <w:highlight w:val="yellow"/>
-                <w14:ligatures w14:val="none"/>
-              </w:rPr>
-            </w:pPr>
-            <w:r>
-              <w:rPr>
-                <w:rFonts w:ascii="Times New Roman" w:eastAsia="Times New Roman" w:hAnsi="Times New Roman" w:cs="Times New Roman"/>
-                <w:kern w:val="0"/>
-                <w:sz w:val="24"/>
-                <w:szCs w:val="24"/>
-                <w:highlight w:val="yellow"/>
+                <w14:ligatures w14:val="none"/>
+              </w:rPr>
+            </w:pPr>
+            <w:r>
+              <w:rPr>
+                <w:rFonts w:ascii="Times New Roman" w:eastAsia="Times New Roman" w:hAnsi="Times New Roman" w:cs="Times New Roman"/>
+                <w:kern w:val="0"/>
+                <w:sz w:val="24"/>
+                <w:szCs w:val="24"/>
                 <w14:ligatures w14:val="none"/>
               </w:rPr>
               <w:t>Must Have</w:t>
@@ -3657,7 +3611,7 @@
                 <w:szCs w:val="24"/>
                 <w14:ligatures w14:val="none"/>
               </w:rPr>
-              <w:t>The database must encrypt sensitive data, including passwords and personal information.</w:t>
+              <w:t xml:space="preserve">Passwords and personal data must be stored encrypted in the database.</w:t>
             </w:r>
           </w:p>
         </w:tc>
@@ -3756,17 +3710,15 @@
                 <w:kern w:val="0"/>
                 <w:sz w:val="24"/>
                 <w:szCs w:val="24"/>
-                <w:highlight w:val="red"/>
-                <w14:ligatures w14:val="none"/>
-              </w:rPr>
-            </w:pPr>
-            <w:r>
-              <w:rPr>
-                <w:rFonts w:ascii="Times New Roman" w:eastAsia="Times New Roman" w:hAnsi="Times New Roman" w:cs="Times New Roman"/>
-                <w:kern w:val="0"/>
-                <w:sz w:val="24"/>
-                <w:szCs w:val="24"/>
-                <w:highlight w:val="red"/>
+                <w14:ligatures w14:val="none"/>
+              </w:rPr>
+            </w:pPr>
+            <w:r>
+              <w:rPr>
+                <w:rFonts w:ascii="Times New Roman" w:eastAsia="Times New Roman" w:hAnsi="Times New Roman" w:cs="Times New Roman"/>
+                <w:kern w:val="0"/>
+                <w:sz w:val="24"/>
+                <w:szCs w:val="24"/>
                 <w14:ligatures w14:val="none"/>
               </w:rPr>
               <w:t>Should Have</w:t>
@@ -3804,7 +3756,7 @@
                 <w:szCs w:val="24"/>
                 <w14:ligatures w14:val="none"/>
               </w:rPr>
-              <w:t>The system should be able to scale horizontally to accommodate growth in user base and data volume.</w:t>
+              <w:t xml:space="preserve">The system should be able to scale out as the number of users and the amount of data grow.</w:t>
             </w:r>
           </w:p>
         </w:tc>
@@ -3903,17 +3855,15 @@
                 <w:kern w:val="0"/>
                 <w:sz w:val="24"/>
                 <w:szCs w:val="24"/>
-                <w:highlight w:val="red"/>
-                <w14:ligatures w14:val="none"/>
-              </w:rPr>
-            </w:pPr>
-            <w:r>
-              <w:rPr>
-                <w:rFonts w:ascii="Times New Roman" w:eastAsia="Times New Roman" w:hAnsi="Times New Roman" w:cs="Times New Roman"/>
-                <w:kern w:val="0"/>
-                <w:sz w:val="24"/>
-                <w:szCs w:val="24"/>
-                <w:highlight w:val="red"/>
+                <w14:ligatures w14:val="none"/>
+              </w:rPr>
+            </w:pPr>
+            <w:r>
+              <w:rPr>
+                <w:rFonts w:ascii="Times New Roman" w:eastAsia="Times New Roman" w:hAnsi="Times New Roman" w:cs="Times New Roman"/>
+                <w:kern w:val="0"/>
+                <w:sz w:val="24"/>
+                <w:szCs w:val="24"/>
                 <w14:ligatures w14:val="none"/>
               </w:rPr>
               <w:t>Should Have</w:t>
@@ -3951,7 +3901,7 @@
                 <w:szCs w:val="24"/>
                 <w14:ligatures w14:val="none"/>
               </w:rPr>
-              <w:t>The system should maintain an uptime of 99.9%, ensuring users can access their accounts at any time.</w:t>
+              <w:t xml:space="preserve">The system should be up 99.9% of the time, so users can get to their accounts whenever they need to.</w:t>
             </w:r>
           </w:p>
         </w:tc>
@@ -4050,17 +4000,15 @@
                 <w:kern w:val="0"/>
                 <w:sz w:val="24"/>
                 <w:szCs w:val="24"/>
-                <w:highlight w:val="blue"/>
-                <w14:ligatures w14:val="none"/>
-              </w:rPr>
-            </w:pPr>
-            <w:r>
-              <w:rPr>
-                <w:rFonts w:ascii="Times New Roman" w:eastAsia="Times New Roman" w:hAnsi="Times New Roman" w:cs="Times New Roman"/>
-                <w:kern w:val="0"/>
-                <w:sz w:val="24"/>
-                <w:szCs w:val="24"/>
-                <w:highlight w:val="blue"/>
+                <w14:ligatures w14:val="none"/>
+              </w:rPr>
+            </w:pPr>
+            <w:r>
+              <w:rPr>
+                <w:rFonts w:ascii="Times New Roman" w:eastAsia="Times New Roman" w:hAnsi="Times New Roman" w:cs="Times New Roman"/>
+                <w:kern w:val="0"/>
+                <w:sz w:val="24"/>
+                <w:szCs w:val="24"/>
                 <w14:ligatures w14:val="none"/>
               </w:rPr>
               <w:t>Could Have</w:t>
@@ -4098,7 +4046,7 @@
                 <w:szCs w:val="24"/>
                 <w14:ligatures w14:val="none"/>
               </w:rPr>
-              <w:t>The user interface must be intuitive and easy to navigate, minimizing the learning curve for new users.</w:t>
+              <w:t xml:space="preserve">The interface should be simple and easy to find your way around, even for first-time users.</w:t>
             </w:r>
           </w:p>
         </w:tc>
@@ -4212,7 +4160,7 @@
           <w:sz w:val="24"/>
           <w:szCs w:val="24"/>
         </w:rPr>
-        <w:t>Must Have: These are essential for a banking system, allowing users to perform key operations like accessing their accounts, checking balances, and transferring funds. They play a crucial role in building user trust and satisfaction.</w:t>
+        <w:t xml:space="preserve">Must Have: These are the basics any banking system needs: logging in, checking balances, and moving money. Without them the system isn't usable, and customers wouldn't trust it.</w:t>
       </w:r>
     </w:p>
     <w:p>
@@ -4238,7 +4186,7 @@
           <w:sz w:val="24"/>
           <w:szCs w:val="24"/>
         </w:rPr>
-        <w:t>Should Have: These features are important for enhancing user experience and adding significant value, such as customer support and card management, but can be scheduled for future updates.</w:t>
+        <w:t xml:space="preserve">Should Have: Features like card management and customer support add a lot of value, but the system can launch without them and pick them up in a later update.</w:t>
       </w:r>
     </w:p>
     <w:p>
@@ -4264,7 +4212,7 @@
           <w:sz w:val="24"/>
           <w:szCs w:val="24"/>
         </w:rPr>
-        <w:t>Could Have: These are additional features that are beneficial but can be delayed if needed, enabling the bank to launch with the core functionalities first.</w:t>
+        <w:t xml:space="preserve">Could Have: Nice to have, but they can wait. Leaving them out at first lets the bank launch with the core features sooner.</w:t>
       </w:r>
     </w:p>
     <w:p>
@@ -4290,7 +4238,7 @@
           <w:sz w:val="24"/>
           <w:szCs w:val="24"/>
         </w:rPr>
-        <w:t>Won’t Have: These are non-essential features that can be deferred to future versions, allowing the focus to remain on the critical aspects of the system initially.</w:t>
+        <w:t xml:space="preserve">Won't Have: These are out of scope for this release. They may come in a future version, but for now the focus stays on the essentials.</w:t>
       </w:r>
     </w:p>
     <w:p>
@@ -4358,7 +4306,7 @@
           <w:sz w:val="24"/>
           <w:szCs w:val="24"/>
         </w:rPr>
-        <w:t>Must Have: Performance and security are critical in banking, ensuring user data is safeguarded and the system remains responsive under heavy load.</w:t>
+        <w:t xml:space="preserve">Must Have: In banking, performance and security can't be compromised. Customer data has to be protected, and the system has to stay fast even when it's busy.</w:t>
       </w:r>
     </w:p>
     <w:p>
@@ -4384,7 +4332,7 @@
           <w:sz w:val="24"/>
           <w:szCs w:val="24"/>
         </w:rPr>
-        <w:t>Should Have: Scalability and availability are vital to ensure the system can expand and provide continuous access, which is essential for user confidence and operational efficiency.</w:t>
+        <w:t xml:space="preserve">Should Have: People expect to reach their money at any time, and the bank will grow, so the system needs to stay available and have room to scale.</w:t>
       </w:r>
     </w:p>
     <w:p>
@@ -4407,7 +4355,7 @@
           <w:sz w:val="24"/>
           <w:szCs w:val="24"/>
         </w:rPr>
-        <w:t>Could Have: Usability is key for customer retention, but can be improved over time, allowing for an initial deployment while planning for future enhancements.</w:t>
+        <w:t xml:space="preserve">Could Have: A friendly interface helps keep customers, but it can be polished over time after the first release.</w:t>
       </w:r>
     </w:p>
     <w:sectPr>

</xml_diff>